<commit_message>
Repesca: cierre el domingo 25 a las 23:59 y números nuevos (+3.500 suscriptores, menos de 5% de churn)
Co-Authored-By: Claude Opus 5.5 <noreply@anthropic.com>
Claude-Session: https://claude.ai/code/session_011cHZCWCbXV7WqvXcQ2jLM2
</commit_message>
<xml_diff>
--- a/agentes/mi-negocio/entregables/repesca-24-10-ads.docx
+++ b/agentes/mi-negocio/entregables/repesca-24-10-ads.docx
@@ -328,13 +328,13 @@
       </w:r>
     </w:p>
     <w:bookmarkEnd w:id="20"/>
-    <w:bookmarkStart w:id="21" w:name="X3fb91b065bfd719fe224c090bb9abd879a9f17c"/>
+    <w:bookmarkStart w:id="21" w:name="Xb30fecafea3361379a04ad5ca99c9d4c2dd4d06"/>
     <w:p>
       <w:pPr>
         <w:pStyle w:val="Heading2"/>
       </w:pPr>
       <w:r>
-        <w:t xml:space="preserve">RP-1 · El número · "Con 2.200 suscriptores, sin pelear el CPA"</w:t>
+        <w:t xml:space="preserve">RP-1 · El número · "Con +3.500 suscriptores, sin pelear el CPA"</w:t>
       </w:r>
     </w:p>
     <w:p>
@@ -417,7 +417,7 @@
         <w:pStyle w:val="BodyText"/>
       </w:pPr>
       <w:r>
-        <w:t xml:space="preserve">Lo único que cambié fue el modelo. Hoy tengo 2.200 suscriptores activos, con 1,28% de churn, que me compran todos los meses sin que los tenga que volver a pautar.</w:t>
+        <w:t xml:space="preserve">Lo único que cambié fue el modelo. Hoy tengo más de 3.500 suscriptores activos, con menos de 5% de churn, que me compran todos los meses sin que los tenga que volver a pautar.</w:t>
       </w:r>
     </w:p>
     <w:p>
@@ -567,7 +567,7 @@
         <w:pStyle w:val="BlockText"/>
       </w:pPr>
       <w:r>
-        <w:t xml:space="preserve">Más de 250 millones factura mi ecom de químicos, con 2.200 suscriptores activos y 1,28% de churn. El lunes 19 di una clase privada con 200 personas y mucha gente se quedó afuera, así que</w:t>
+        <w:t xml:space="preserve">Más de 250 millones factura mi ecom de químicos, con más de 3.500 suscriptores activos y menos de 5% de churn. El lunes 19 di una clase privada con 200 personas y mucha gente se quedó afuera, así que</w:t>
       </w:r>
       <w:r>
         <w:t xml:space="preserve"> </w:t>
@@ -820,19 +820,19 @@
               <w:t xml:space="preserve">(levanta el pote)</w:t>
             </w:r>
             <w:r>
-              <w:t xml:space="preserve">: con suscripción. El cliente compra una vez y te paga todos los meses. Y es lo mismo que me permitió escalar mi ecom de químicos a más de 250 millones, con 2.200 suscriptores activos.</w:t>
-            </w:r>
-          </w:p>
-        </w:tc>
-        <w:tc>
-          <w:tcPr/>
-          <w:p>
-            <w:pPr>
-              <w:pStyle w:val="Compact"/>
-              <w:jc w:val="left"/>
-            </w:pPr>
-            <w:r>
-              <w:t xml:space="preserve">(pote del producto) → panel de suscriptores: 2.200 activos · 1,28% churn.</w:t>
+              <w:t xml:space="preserve">: con suscripción. El cliente compra una vez y te paga todos los meses. Y es lo mismo que me permitió escalar mi ecom de químicos a más de 250 millones, con más de 3.500 suscriptores activos.</w:t>
+            </w:r>
+          </w:p>
+        </w:tc>
+        <w:tc>
+          <w:tcPr/>
+          <w:p>
+            <w:pPr>
+              <w:pStyle w:val="Compact"/>
+              <w:jc w:val="left"/>
+            </w:pPr>
+            <w:r>
+              <w:t xml:space="preserve">(pote del producto) → panel de suscriptores: +3.500 activos · menos de 5% de churn.</w:t>
             </w:r>
           </w:p>
         </w:tc>
@@ -1020,7 +1020,7 @@
               <w:t xml:space="preserve"> </w:t>
             </w:r>
             <w:r>
-              <w:t xml:space="preserve">(62–70 s) — Es el mismo método con el que tengo 1,28% de churn. Este sábado 24 de octubre lo muestro todo. Hacé clic en este anuncio y reservá tu lugar. Te espero ahí.</w:t>
+              <w:t xml:space="preserve">(62–70 s) — Es el mismo método con el que tengo menos de 5% de churn. Este sábado 24 de octubre lo muestro todo. Hacé clic en este anuncio y reservá tu lugar. Te espero ahí.</w:t>
             </w:r>
           </w:p>
         </w:tc>
@@ -1273,7 +1273,7 @@
         <w:pStyle w:val="BodyText"/>
       </w:pPr>
       <w:r>
-        <w:t xml:space="preserve">Y hay una cosa que quiero que te lleves: ninguna de las tres se arregla con un creativo mejor. Se arregla cambiando el modelo. Hoy tengo 2.200 suscriptores activos, con 1,28% de churn, y una marca que con la pauta apagada sigue cobrando recurrencias con un 50% de margen.</w:t>
+        <w:t xml:space="preserve">Y hay una cosa que quiero que te lleves: ninguna de las tres se arregla con un creativo mejor. Se arregla cambiando el modelo. Hoy tengo más de 3.500 suscriptores activos, con menos de 5% de churn, y una marca que con la pauta apagada sigue cobrando recurrencias con un 50% de margen.</w:t>
       </w:r>
     </w:p>
     <w:p>

</xml_diff>

<commit_message>
Repesca: link del grupo, el Zoom solo por el grupo, promesa nueva, regalos en vivo, repetición en /replay y 4 lugares
Co-Authored-By: Claude Opus 5.5 <noreply@anthropic.com>
Claude-Session: https://claude.ai/code/session_011cHZCWCbXV7WqvXcQ2jLM2
</commit_message>
<xml_diff>
--- a/agentes/mi-negocio/entregables/repesca-24-10-ads.docx
+++ b/agentes/mi-negocio/entregables/repesca-24-10-ads.docx
@@ -299,13 +299,13 @@
           <w:bCs/>
           <w:b/>
         </w:rPr>
-        <w:t xml:space="preserve">Promesa de la clase (21-oct):</w:t>
-      </w:r>
-      <w:r>
-        <w:t xml:space="preserve"> </w:t>
-      </w:r>
-      <w:r>
-        <w:t xml:space="preserve">"Cómo escalé mi ecom de químicos a +$250.000.000 con el modelo de suscripciones". Reemplaza al 60 → 156.798.062. Va en el anuncio de la repesca de los 3 guiones y en los captions.</w:t>
+        <w:t xml:space="preserve">Promesa de la clase (22-oct):</w:t>
+      </w:r>
+      <w:r>
+        <w:t xml:space="preserve"> </w:t>
+      </w:r>
+      <w:r>
+        <w:t xml:space="preserve">"Cómo podés escalar tu ecom a +100 millones de pesos mensuales con el modelo de suscripción". El +$250M queda como prueba (lo que factura el ecom de Manu), no como promesa. Va en el anuncio de la repesca de los 3 guiones y en los captions.</w:t>
       </w:r>
     </w:p>
     <w:p>
@@ -521,7 +521,7 @@
         <w:pStyle w:val="BodyText"/>
       </w:pPr>
       <w:r>
-        <w:t xml:space="preserve">Ahí te voy a mostrar cómo escalé mi ecom de químicos a más de 250 millones con el modelo de suscripciones: el Método B.A.S.E. Te voy a dar el roadmap para migrar tu ecommerce a suscripción con tu base de compradores y tus campañas actuales, sin testear nada de cero. El Simulador de Suscripción, para que veas cuánto podés pagar por cada cliente, con IVA y Ganancias adentro. Y la IA que te escribe los flujos de email de tu suscripción para Klaviyo, para que lo copies y lo pegues.</w:t>
+        <w:t xml:space="preserve">Ahí te voy a mostrar cómo podés escalar tu ecom a más de 100 millones de pesos por mes con el modelo de suscripción: el Método B.A.S.E. Te voy a dar el roadmap para migrar tu ecommerce a suscripción con tu base de compradores y tus campañas actuales, sin testear nada de cero. El Simulador de Suscripción, para que veas cuánto podés pagar por cada cliente, con IVA y Ganancias adentro. Y la IA que te escribe los flujos de email de tu suscripción para Klaviyo, para que lo copies y lo pegues.</w:t>
       </w:r>
     </w:p>
     <w:p>
@@ -547,7 +547,7 @@
         <w:pStyle w:val="BodyText"/>
       </w:pPr>
       <w:r>
-        <w:t xml:space="preserve">Es lo único que necesitás para poder pagar 2,5 veces más por cada cliente que tu competencia. Hacé clic en este anuncio y reservá tu lugar: es privada, si no te anotás no podés entrar. Sábado 24. Te espero ahí.</w:t>
+        <w:t xml:space="preserve">Es lo único que necesitás para escalar tu ecom a más de 100 millones por mes. Hacé clic en este anuncio y reservá tu lugar: es privada, si no te anotás no podés entrar. Sábado 24. Te espero ahí.</w:t>
       </w:r>
     </w:p>
     <w:p>
@@ -583,7 +583,7 @@
         <w:t xml:space="preserve"> </w:t>
       </w:r>
       <w:r>
-        <w:t xml:space="preserve">para los que se la perdieron: cómo escalé mi ecom de químicos a +$250.000.000 con el modelo de suscripciones. Regalo por asistir: el roadmap, el Simulador de Suscripción y la IA que te escribe los flujos de email para Klaviyo. Solo ecommerce en Tiendanube o Shopify. 100% gratis. Anotate 👇</w:t>
+        <w:t xml:space="preserve">para los que se la perdieron: cómo podés escalar tu ecom a más de 100 millones de pesos por mes con el modelo de suscripción. Regalo por asistir: el roadmap, el Simulador de Suscripción y la IA que te escribe los flujos de email para Klaviyo. Solo ecommerce en Tiendanube o Shopify. 100% gratis. Anotate 👇</w:t>
       </w:r>
     </w:p>
     <w:p>
@@ -935,7 +935,7 @@
               <w:t xml:space="preserve"> </w:t>
             </w:r>
             <w:r>
-              <w:t xml:space="preserve">(34–45 s) — El lunes 19 di una clase privada con 200 personas, y como mucha gente no pudo entrar, este sábado 24 de octubre la vuelvo a dar por última vez en vivo, para todos los que se la perdieron. Te voy a mostrar cómo escalé mi ecom de químicos a más de 250 millones con el modelo de suscripciones.</w:t>
+              <w:t xml:space="preserve">(34–45 s) — El lunes 19 di una clase privada con 200 personas, y como mucha gente no pudo entrar, este sábado 24 de octubre la vuelvo a dar por última vez en vivo, para todos los que se la perdieron. Te voy a mostrar cómo podés escalar tu ecom a más de 100 millones de pesos por mes con el modelo de suscripción.</w:t>
             </w:r>
           </w:p>
         </w:tc>
@@ -1071,7 +1071,7 @@
         <w:t xml:space="preserve"> </w:t>
       </w:r>
       <w:r>
-        <w:t xml:space="preserve">para los que se la perdieron: cómo escalé mi ecom de químicos a +$250.000.000 con el modelo de suscripciones. Solo ecommerce en Tiendanube o Shopify. 100% gratis. Anotate 👇</w:t>
+        <w:t xml:space="preserve">para los que se la perdieron: cómo podés escalar tu ecom a más de 100 millones de pesos por mes con el modelo de suscripción. Solo ecommerce en Tiendanube o Shopify. 100% gratis. Anotate 👇</w:t>
       </w:r>
     </w:p>
     <w:p>
@@ -1307,7 +1307,7 @@
         <w:pStyle w:val="BodyText"/>
       </w:pPr>
       <w:r>
-        <w:t xml:space="preserve">El lunes 19 di una clase privada mostrándolo y entraron 200 personas. Pero un montón de gente se quedó afuera. Así que este sábado 24 de octubre, a las 18, la vuelvo a dar para todos los que se la perdieron. Te voy a mostrar cómo escalé mi ecom de químicos a más de 250 millones con el modelo de suscripciones.</w:t>
+        <w:t xml:space="preserve">El lunes 19 di una clase privada mostrándolo y entraron 200 personas. Pero un montón de gente se quedó afuera. Así que este sábado 24 de octubre, a las 18, la vuelvo a dar para todos los que se la perdieron. Te voy a mostrar cómo podés escalar tu ecom a más de 100 millones de pesos por mes con el modelo de suscripción.</w:t>
       </w:r>
       <w:r>
         <w:t xml:space="preserve"> </w:t>
@@ -1375,7 +1375,7 @@
         <w:t xml:space="preserve"> </w:t>
       </w:r>
       <w:r>
-        <w:t xml:space="preserve">para los que se la perdieron: cómo escalé mi ecom de químicos a +$250.000.000 con el modelo de suscripciones. Solo ecommerce en Tiendanube o Shopify. 100% gratis. Anotate 👇</w:t>
+        <w:t xml:space="preserve">para los que se la perdieron: cómo podés escalar tu ecom a más de 100 millones de pesos por mes con el modelo de suscripción. Solo ecommerce en Tiendanube o Shopify. 100% gratis. Anotate 👇</w:t>
       </w:r>
     </w:p>
     <w:p>
@@ -1480,7 +1480,7 @@
         <w:t xml:space="preserve"> </w:t>
       </w:r>
       <w:r>
-        <w:t xml:space="preserve">Cómo escalé mi ecom de químicos a +$250.000.000 con el modelo de suscripciones.</w:t>
+        <w:t xml:space="preserve">Cómo podés escalar tu ecom a más de 100 millones de pesos por mes con el modelo de suscripción.</w:t>
       </w:r>
     </w:p>
     <w:bookmarkEnd w:id="24"/>

</xml_diff>